<commit_message>
Adding to e01 outline
</commit_message>
<xml_diff>
--- a/Scripts/E01-Script.docx
+++ b/Scripts/E01-Script.docx
@@ -168,32 +168,24 @@
         <w:pStyle w:val="ActionSceneSetting"/>
       </w:pPr>
       <w:r>
+        <w:rPr>
+          <w:b/>
+          <w:bCs/>
+        </w:rPr>
         <w:t>[</w:t>
       </w:r>
-      <w:sdt>
-        <w:sdtPr>
-          <w:id w:val="380913452"/>
-          <w:placeholder>
-            <w:docPart w:val="706429FC64324BE685B1B4331B38E816"/>
-          </w:placeholder>
-          <w:temporary/>
-          <w:showingPlcHdr/>
-          <w15:appearance w15:val="hidden"/>
-        </w:sdtPr>
-        <w:sdtEndPr>
-          <w:rPr>
-            <w:rStyle w:val="Strong"/>
-            <w:b/>
-            <w:bCs/>
-          </w:rPr>
-        </w:sdtEndPr>
-        <w:sdtContent>
-          <w:r>
-            <w:t>INT/EXT.</w:t>
-          </w:r>
-        </w:sdtContent>
-      </w:sdt>
-      <w:r>
+      <w:r>
+        <w:rPr>
+          <w:b/>
+          <w:bCs/>
+        </w:rPr>
+        <w:t>int.</w:t>
+      </w:r>
+      <w:r>
+        <w:rPr>
+          <w:b/>
+          <w:bCs/>
+        </w:rPr>
         <w:t>]</w:t>
       </w:r>
       <w:r>
@@ -204,36 +196,26 @@
         </w:rPr>
         <w:t xml:space="preserve"> </w:t>
       </w:r>
-      <w:sdt>
-        <w:sdtPr>
-          <w:id w:val="-987860291"/>
-          <w:placeholder>
-            <w:docPart w:val="C6F514B109F24F41B97B66C94B5DA893"/>
-          </w:placeholder>
-          <w:temporary/>
-          <w:showingPlcHdr/>
-          <w15:appearance w15:val="hidden"/>
-        </w:sdtPr>
-        <w:sdtEndPr>
-          <w:rPr>
-            <w:rStyle w:val="Strong"/>
-            <w:b/>
-            <w:bCs/>
-          </w:rPr>
-        </w:sdtEndPr>
-        <w:sdtContent>
-          <w:r>
-            <w:t>[LOCATION]</w:t>
-          </w:r>
-        </w:sdtContent>
-      </w:sdt>
+      <w:r>
+        <w:rPr>
+          <w:b/>
+          <w:bCs/>
+        </w:rPr>
+        <w:t>studio</w:t>
+      </w:r>
       <w:r>
         <w:rPr>
           <w:rStyle w:val="Strong"/>
           <w:b w:val="0"/>
           <w:bCs w:val="0"/>
         </w:rPr>
-        <w:t xml:space="preserve"> —</w:t>
+        <w:t xml:space="preserve"> </w:t>
+      </w:r>
+      <w:r>
+        <w:rPr>
+          <w:rStyle w:val="Strong"/>
+        </w:rPr>
+        <w:t>—</w:t>
       </w:r>
       <w:r>
         <w:rPr>
@@ -246,13 +228,8 @@
       <w:r>
         <w:rPr>
           <w:rStyle w:val="Strong"/>
-          <w:b w:val="0"/>
-          <w:bCs w:val="0"/>
-        </w:rPr>
-        <w:t>[</w:t>
-      </w:r>
-      <w:r>
-        <w:t>TIME OF DAY]</w:t>
+        </w:rPr>
+        <w:t>cold open</w:t>
       </w:r>
     </w:p>
     <w:sdt>
@@ -285,7 +262,7 @@
         </w:rPr>
       </w:pPr>
       <w:r>
-        <w:t>[character #1 NAME]</w:t>
+        <w:t>nico</w:t>
       </w:r>
       <w:r>
         <w:rPr>
@@ -295,7 +272,7 @@
         <w:t xml:space="preserve"> </w:t>
       </w:r>
       <w:r>
-        <w:t>[EXTENSION]</w:t>
+        <w:t>(talking head)</w:t>
       </w:r>
       <w:r>
         <w:rPr>
@@ -318,28 +295,40 @@
     </w:p>
     <w:p>
       <w:pPr>
-        <w:pStyle w:val="CharacterName"/>
-        <w:rPr>
-          <w:rStyle w:val="Strong"/>
-          <w:rFonts w:ascii="Courier" w:hAnsi="Courier"/>
-          <w:b w:val="0"/>
-        </w:rPr>
-      </w:pPr>
-      <w:r>
-        <w:t>[CHARACTER #2 NAME]</w:t>
-      </w:r>
-    </w:p>
-    <w:p>
-      <w:pPr>
-        <w:pStyle w:val="Parenthetical"/>
-      </w:pPr>
-      <w:r>
-        <w:t>[PARENTHETICAL]</w:t>
-      </w:r>
-    </w:p>
-    <w:p>
-      <w:pPr>
-        <w:pStyle w:val="Dialogue"/>
+        <w:pStyle w:val="Transition"/>
+      </w:pPr>
+      <w:r>
+        <w:t>[TRANSITION:]</w:t>
+      </w:r>
+    </w:p>
+    <w:p>
+      <w:pPr>
+        <w:pStyle w:val="FadeOut"/>
+        <w:jc w:val="left"/>
+        <w:rPr>
+          <w:b/>
+          <w:bCs/>
+        </w:rPr>
+      </w:pPr>
+      <w:r>
+        <w:rPr>
+          <w:b/>
+          <w:bCs/>
+        </w:rPr>
+        <w:t>[Graphic] title card</w:t>
+      </w:r>
+    </w:p>
+    <w:p>
+      <w:pPr>
+        <w:pStyle w:val="Transition"/>
+      </w:pPr>
+      <w:r>
+        <w:t>[TRANSITION:]</w:t>
+      </w:r>
+    </w:p>
+    <w:p>
+      <w:pPr>
+        <w:pStyle w:val="ActionSceneSetting"/>
         <w:rPr>
           <w:rStyle w:val="Strong"/>
           <w:b w:val="0"/>
@@ -347,7 +336,68 @@
         </w:rPr>
       </w:pPr>
       <w:r>
-        <w:t>[DIALOGUE]</w:t>
+        <w:rPr>
+          <w:b/>
+          <w:bCs/>
+        </w:rPr>
+        <w:t>[</w:t>
+      </w:r>
+      <w:r>
+        <w:rPr>
+          <w:b/>
+          <w:bCs/>
+        </w:rPr>
+        <w:t>int.</w:t>
+      </w:r>
+      <w:r>
+        <w:rPr>
+          <w:b/>
+          <w:bCs/>
+        </w:rPr>
+        <w:t>]</w:t>
+      </w:r>
+      <w:r>
+        <w:rPr>
+          <w:rStyle w:val="Strong"/>
+          <w:b w:val="0"/>
+          <w:bCs w:val="0"/>
+        </w:rPr>
+        <w:t xml:space="preserve"> </w:t>
+      </w:r>
+      <w:r>
+        <w:rPr>
+          <w:b/>
+          <w:bCs/>
+        </w:rPr>
+        <w:t>studio</w:t>
+      </w:r>
+      <w:r>
+        <w:rPr>
+          <w:rStyle w:val="Strong"/>
+          <w:b w:val="0"/>
+          <w:bCs w:val="0"/>
+        </w:rPr>
+        <w:t xml:space="preserve"> </w:t>
+      </w:r>
+      <w:r>
+        <w:rPr>
+          <w:rStyle w:val="Strong"/>
+        </w:rPr>
+        <w:t>—</w:t>
+      </w:r>
+      <w:r>
+        <w:rPr>
+          <w:rStyle w:val="Strong"/>
+          <w:b w:val="0"/>
+          <w:bCs w:val="0"/>
+        </w:rPr>
+        <w:t xml:space="preserve"> </w:t>
+      </w:r>
+      <w:r>
+        <w:rPr>
+          <w:rStyle w:val="Strong"/>
+        </w:rPr>
+        <w:t>course ideology</w:t>
       </w:r>
     </w:p>
     <w:p>
@@ -356,7 +406,7 @@
         <w:jc w:val="left"/>
       </w:pPr>
       <w:r>
-        <w:t>[SUBHEADER]</w:t>
+        <w:t>[action]</w:t>
       </w:r>
     </w:p>
     <w:p>
@@ -364,7 +414,13 @@
         <w:pStyle w:val="CharacterName"/>
       </w:pPr>
       <w:r>
-        <w:t>[CHARACTER #2 NAME] (CONT’d)</w:t>
+        <w:t>nico</w:t>
+      </w:r>
+      <w:r>
+        <w:t xml:space="preserve"> </w:t>
+      </w:r>
+      <w:r>
+        <w:t>(talking head)</w:t>
       </w:r>
     </w:p>
     <w:p>
@@ -391,6 +447,782 @@
       <w:r>
         <w:t>]</w:t>
       </w:r>
+    </w:p>
+    <w:p>
+      <w:pPr>
+        <w:pStyle w:val="ActionSceneSetting"/>
+        <w:rPr>
+          <w:rStyle w:val="Strong"/>
+          <w:b w:val="0"/>
+          <w:bCs w:val="0"/>
+        </w:rPr>
+      </w:pPr>
+      <w:r>
+        <w:rPr>
+          <w:b/>
+          <w:bCs/>
+        </w:rPr>
+        <w:t>[</w:t>
+      </w:r>
+      <w:r>
+        <w:rPr>
+          <w:b/>
+          <w:bCs/>
+        </w:rPr>
+        <w:t>screen</w:t>
+      </w:r>
+      <w:r>
+        <w:rPr>
+          <w:b/>
+          <w:bCs/>
+        </w:rPr>
+        <w:t>]</w:t>
+      </w:r>
+      <w:r>
+        <w:rPr>
+          <w:rStyle w:val="Strong"/>
+          <w:b w:val="0"/>
+          <w:bCs w:val="0"/>
+        </w:rPr>
+        <w:t xml:space="preserve"> </w:t>
+      </w:r>
+      <w:r>
+        <w:rPr>
+          <w:b/>
+          <w:bCs/>
+        </w:rPr>
+        <w:t>projucer download &amp; setup</w:t>
+      </w:r>
+    </w:p>
+    <w:p>
+      <w:pPr>
+        <w:pStyle w:val="FadeOut"/>
+        <w:jc w:val="left"/>
+      </w:pPr>
+      <w:r>
+        <w:t>[action]</w:t>
+      </w:r>
+    </w:p>
+    <w:p>
+      <w:pPr>
+        <w:pStyle w:val="CharacterName"/>
+      </w:pPr>
+      <w:r>
+        <w:t>nico (</w:t>
+      </w:r>
+      <w:r>
+        <w:t>V.o.</w:t>
+      </w:r>
+      <w:r>
+        <w:t>)</w:t>
+      </w:r>
+    </w:p>
+    <w:p>
+      <w:pPr>
+        <w:pStyle w:val="Dialogue"/>
+      </w:pPr>
+      <w:r>
+        <w:t>[DIALOGUE]</w:t>
+      </w:r>
+    </w:p>
+    <w:p>
+      <w:pPr>
+        <w:pStyle w:val="Transition"/>
+      </w:pPr>
+      <w:r>
+        <w:t>[TRANSITION:]</w:t>
+      </w:r>
+    </w:p>
+    <w:p>
+      <w:pPr>
+        <w:pStyle w:val="ActionSceneSetting"/>
+        <w:rPr>
+          <w:rStyle w:val="Strong"/>
+          <w:b w:val="0"/>
+          <w:bCs w:val="0"/>
+        </w:rPr>
+      </w:pPr>
+      <w:r>
+        <w:rPr>
+          <w:b/>
+          <w:bCs/>
+        </w:rPr>
+        <w:t>[</w:t>
+      </w:r>
+      <w:r>
+        <w:rPr>
+          <w:b/>
+          <w:bCs/>
+        </w:rPr>
+        <w:t>screen</w:t>
+      </w:r>
+      <w:r>
+        <w:rPr>
+          <w:b/>
+          <w:bCs/>
+        </w:rPr>
+        <w:t>]</w:t>
+      </w:r>
+      <w:r>
+        <w:rPr>
+          <w:rStyle w:val="Strong"/>
+          <w:b w:val="0"/>
+          <w:bCs w:val="0"/>
+        </w:rPr>
+        <w:t xml:space="preserve"> </w:t>
+      </w:r>
+      <w:r>
+        <w:rPr>
+          <w:b/>
+          <w:bCs/>
+        </w:rPr>
+        <w:t>cloning the repo</w:t>
+      </w:r>
+    </w:p>
+    <w:p>
+      <w:pPr>
+        <w:pStyle w:val="FadeOut"/>
+        <w:jc w:val="left"/>
+      </w:pPr>
+      <w:r>
+        <w:t>[action]</w:t>
+      </w:r>
+    </w:p>
+    <w:p>
+      <w:pPr>
+        <w:pStyle w:val="CharacterName"/>
+      </w:pPr>
+      <w:r>
+        <w:t>nico (V.o.)</w:t>
+      </w:r>
+    </w:p>
+    <w:p>
+      <w:pPr>
+        <w:pStyle w:val="Dialogue"/>
+      </w:pPr>
+      <w:r>
+        <w:t>[DIALOGUE]</w:t>
+      </w:r>
+    </w:p>
+    <w:p>
+      <w:pPr>
+        <w:pStyle w:val="Transition"/>
+      </w:pPr>
+      <w:r>
+        <w:t>[TRANSITION:]</w:t>
+      </w:r>
+    </w:p>
+    <w:p>
+      <w:pPr>
+        <w:pStyle w:val="ActionSceneSetting"/>
+        <w:rPr>
+          <w:rStyle w:val="Strong"/>
+          <w:b w:val="0"/>
+          <w:bCs w:val="0"/>
+        </w:rPr>
+      </w:pPr>
+      <w:r>
+        <w:rPr>
+          <w:b/>
+          <w:bCs/>
+        </w:rPr>
+        <w:t>[</w:t>
+      </w:r>
+      <w:r>
+        <w:rPr>
+          <w:b/>
+          <w:bCs/>
+        </w:rPr>
+        <w:t>screen</w:t>
+      </w:r>
+      <w:r>
+        <w:rPr>
+          <w:b/>
+          <w:bCs/>
+        </w:rPr>
+        <w:t>]</w:t>
+      </w:r>
+      <w:r>
+        <w:rPr>
+          <w:rStyle w:val="Strong"/>
+          <w:b w:val="0"/>
+          <w:bCs w:val="0"/>
+        </w:rPr>
+        <w:t xml:space="preserve"> </w:t>
+      </w:r>
+      <w:r>
+        <w:rPr>
+          <w:b/>
+          <w:bCs/>
+        </w:rPr>
+        <w:t>creating a new project</w:t>
+      </w:r>
+    </w:p>
+    <w:p>
+      <w:pPr>
+        <w:pStyle w:val="FadeOut"/>
+        <w:jc w:val="left"/>
+      </w:pPr>
+      <w:r>
+        <w:t>[action]</w:t>
+      </w:r>
+    </w:p>
+    <w:p>
+      <w:pPr>
+        <w:pStyle w:val="CharacterName"/>
+      </w:pPr>
+      <w:r>
+        <w:t>nico (V.o.)</w:t>
+      </w:r>
+    </w:p>
+    <w:p>
+      <w:pPr>
+        <w:pStyle w:val="Dialogue"/>
+      </w:pPr>
+      <w:r>
+        <w:t>[DIALOGUE]</w:t>
+      </w:r>
+    </w:p>
+    <w:p>
+      <w:pPr>
+        <w:pStyle w:val="Transition"/>
+      </w:pPr>
+      <w:r>
+        <w:t>[TRANSITION:]</w:t>
+      </w:r>
+    </w:p>
+    <w:p>
+      <w:pPr>
+        <w:pStyle w:val="ActionSceneSetting"/>
+        <w:rPr>
+          <w:rStyle w:val="Strong"/>
+          <w:b w:val="0"/>
+          <w:bCs w:val="0"/>
+        </w:rPr>
+      </w:pPr>
+      <w:r>
+        <w:rPr>
+          <w:b/>
+          <w:bCs/>
+        </w:rPr>
+        <w:t>[</w:t>
+      </w:r>
+      <w:r>
+        <w:rPr>
+          <w:b/>
+          <w:bCs/>
+        </w:rPr>
+        <w:t>screen</w:t>
+      </w:r>
+      <w:r>
+        <w:rPr>
+          <w:b/>
+          <w:bCs/>
+        </w:rPr>
+        <w:t>]</w:t>
+      </w:r>
+      <w:r>
+        <w:rPr>
+          <w:rStyle w:val="Strong"/>
+          <w:b w:val="0"/>
+          <w:bCs w:val="0"/>
+        </w:rPr>
+        <w:t xml:space="preserve"> </w:t>
+      </w:r>
+      <w:r>
+        <w:rPr>
+          <w:b/>
+          <w:bCs/>
+        </w:rPr>
+        <w:t>copying the template</w:t>
+      </w:r>
+    </w:p>
+    <w:p>
+      <w:pPr>
+        <w:pStyle w:val="FadeOut"/>
+        <w:jc w:val="left"/>
+      </w:pPr>
+      <w:r>
+        <w:lastRenderedPageBreak/>
+        <w:t>[action]</w:t>
+      </w:r>
+    </w:p>
+    <w:p>
+      <w:pPr>
+        <w:pStyle w:val="CharacterName"/>
+      </w:pPr>
+      <w:r>
+        <w:t>nico (V.o.)</w:t>
+      </w:r>
+    </w:p>
+    <w:p>
+      <w:pPr>
+        <w:pStyle w:val="Dialogue"/>
+      </w:pPr>
+      <w:r>
+        <w:t>[DIALOGUE]</w:t>
+      </w:r>
+    </w:p>
+    <w:p>
+      <w:pPr>
+        <w:pStyle w:val="Transition"/>
+      </w:pPr>
+      <w:r>
+        <w:t>[TRANSITION:]</w:t>
+      </w:r>
+    </w:p>
+    <w:p>
+      <w:pPr>
+        <w:pStyle w:val="ActionSceneSetting"/>
+        <w:rPr>
+          <w:rStyle w:val="Strong"/>
+          <w:b w:val="0"/>
+          <w:bCs w:val="0"/>
+        </w:rPr>
+      </w:pPr>
+      <w:r>
+        <w:rPr>
+          <w:b/>
+          <w:bCs/>
+        </w:rPr>
+        <w:t>[</w:t>
+      </w:r>
+      <w:r>
+        <w:rPr>
+          <w:b/>
+          <w:bCs/>
+        </w:rPr>
+        <w:t>code gfx</w:t>
+      </w:r>
+      <w:r>
+        <w:rPr>
+          <w:b/>
+          <w:bCs/>
+        </w:rPr>
+        <w:t>]</w:t>
+      </w:r>
+      <w:r>
+        <w:rPr>
+          <w:rStyle w:val="Strong"/>
+          <w:b w:val="0"/>
+          <w:bCs w:val="0"/>
+        </w:rPr>
+        <w:t xml:space="preserve"> </w:t>
+      </w:r>
+      <w:r>
+        <w:rPr>
+          <w:b/>
+          <w:bCs/>
+        </w:rPr>
+        <w:t>adding clipper dsp</w:t>
+      </w:r>
+    </w:p>
+    <w:p>
+      <w:pPr>
+        <w:pStyle w:val="FadeOut"/>
+        <w:jc w:val="left"/>
+      </w:pPr>
+      <w:r>
+        <w:t>[action]</w:t>
+      </w:r>
+    </w:p>
+    <w:p>
+      <w:pPr>
+        <w:pStyle w:val="CharacterName"/>
+      </w:pPr>
+      <w:r>
+        <w:t>nico (V.o.)</w:t>
+      </w:r>
+    </w:p>
+    <w:p>
+      <w:pPr>
+        <w:pStyle w:val="Dialogue"/>
+      </w:pPr>
+      <w:r>
+        <w:t>[DIALOGUE]</w:t>
+      </w:r>
+    </w:p>
+    <w:p>
+      <w:pPr>
+        <w:pStyle w:val="Transition"/>
+      </w:pPr>
+      <w:r>
+        <w:t>[TRANSITION:]</w:t>
+      </w:r>
+    </w:p>
+    <w:p>
+      <w:pPr>
+        <w:pStyle w:val="ActionSceneSetting"/>
+        <w:rPr>
+          <w:rStyle w:val="Strong"/>
+          <w:b w:val="0"/>
+          <w:bCs w:val="0"/>
+        </w:rPr>
+      </w:pPr>
+      <w:r>
+        <w:rPr>
+          <w:b/>
+          <w:bCs/>
+        </w:rPr>
+        <w:t>[</w:t>
+      </w:r>
+      <w:r>
+        <w:rPr>
+          <w:b/>
+          <w:bCs/>
+        </w:rPr>
+        <w:t>ableton</w:t>
+      </w:r>
+      <w:r>
+        <w:rPr>
+          <w:b/>
+          <w:bCs/>
+        </w:rPr>
+        <w:t>]</w:t>
+      </w:r>
+      <w:r>
+        <w:rPr>
+          <w:rStyle w:val="Strong"/>
+          <w:b w:val="0"/>
+          <w:bCs w:val="0"/>
+        </w:rPr>
+        <w:t xml:space="preserve"> </w:t>
+      </w:r>
+      <w:r>
+        <w:rPr>
+          <w:b/>
+          <w:bCs/>
+        </w:rPr>
+        <w:t>testing clipper</w:t>
+      </w:r>
+    </w:p>
+    <w:p>
+      <w:pPr>
+        <w:pStyle w:val="FadeOut"/>
+        <w:jc w:val="left"/>
+      </w:pPr>
+      <w:r>
+        <w:t>[action]</w:t>
+      </w:r>
+    </w:p>
+    <w:p>
+      <w:pPr>
+        <w:pStyle w:val="CharacterName"/>
+      </w:pPr>
+      <w:r>
+        <w:t>nico (V.o.)</w:t>
+      </w:r>
+    </w:p>
+    <w:p>
+      <w:pPr>
+        <w:pStyle w:val="Dialogue"/>
+      </w:pPr>
+      <w:r>
+        <w:t>[DIALOGUE]</w:t>
+      </w:r>
+    </w:p>
+    <w:p>
+      <w:pPr>
+        <w:pStyle w:val="Transition"/>
+      </w:pPr>
+      <w:r>
+        <w:t>[TRANSITION:]</w:t>
+      </w:r>
+    </w:p>
+    <w:p>
+      <w:pPr>
+        <w:pStyle w:val="ActionSceneSetting"/>
+        <w:rPr>
+          <w:rStyle w:val="Strong"/>
+          <w:b w:val="0"/>
+          <w:bCs w:val="0"/>
+        </w:rPr>
+      </w:pPr>
+      <w:r>
+        <w:rPr>
+          <w:b/>
+          <w:bCs/>
+        </w:rPr>
+        <w:t>[</w:t>
+      </w:r>
+      <w:r>
+        <w:rPr>
+          <w:b/>
+          <w:bCs/>
+        </w:rPr>
+        <w:t>code gfx</w:t>
+      </w:r>
+      <w:r>
+        <w:rPr>
+          <w:b/>
+          <w:bCs/>
+        </w:rPr>
+        <w:t>]</w:t>
+      </w:r>
+      <w:r>
+        <w:rPr>
+          <w:rStyle w:val="Strong"/>
+          <w:b w:val="0"/>
+          <w:bCs w:val="0"/>
+        </w:rPr>
+        <w:t xml:space="preserve"> </w:t>
+      </w:r>
+      <w:r>
+        <w:rPr>
+          <w:b/>
+          <w:bCs/>
+        </w:rPr>
+        <w:t>adding threshold parameter</w:t>
+      </w:r>
+    </w:p>
+    <w:p>
+      <w:pPr>
+        <w:pStyle w:val="FadeOut"/>
+        <w:jc w:val="left"/>
+      </w:pPr>
+      <w:r>
+        <w:t>[action]</w:t>
+      </w:r>
+    </w:p>
+    <w:p>
+      <w:pPr>
+        <w:pStyle w:val="CharacterName"/>
+      </w:pPr>
+      <w:r>
+        <w:t>nico (V.o.)</w:t>
+      </w:r>
+    </w:p>
+    <w:p>
+      <w:pPr>
+        <w:pStyle w:val="Dialogue"/>
+      </w:pPr>
+      <w:r>
+        <w:t>[DIALOGUE]</w:t>
+      </w:r>
+    </w:p>
+    <w:p>
+      <w:pPr>
+        <w:pStyle w:val="Transition"/>
+      </w:pPr>
+      <w:r>
+        <w:t>[TRANSITION:]</w:t>
+      </w:r>
+    </w:p>
+    <w:p>
+      <w:pPr>
+        <w:pStyle w:val="ActionSceneSetting"/>
+        <w:rPr>
+          <w:rStyle w:val="Strong"/>
+          <w:b w:val="0"/>
+          <w:bCs w:val="0"/>
+        </w:rPr>
+      </w:pPr>
+      <w:r>
+        <w:rPr>
+          <w:b/>
+          <w:bCs/>
+        </w:rPr>
+        <w:t>[</w:t>
+      </w:r>
+      <w:r>
+        <w:rPr>
+          <w:b/>
+          <w:bCs/>
+        </w:rPr>
+        <w:t>ableton</w:t>
+      </w:r>
+      <w:r>
+        <w:rPr>
+          <w:b/>
+          <w:bCs/>
+        </w:rPr>
+        <w:t>]</w:t>
+      </w:r>
+      <w:r>
+        <w:rPr>
+          <w:rStyle w:val="Strong"/>
+          <w:b w:val="0"/>
+          <w:bCs w:val="0"/>
+        </w:rPr>
+        <w:t xml:space="preserve"> </w:t>
+      </w:r>
+      <w:r>
+        <w:rPr>
+          <w:b/>
+          <w:bCs/>
+        </w:rPr>
+        <w:t xml:space="preserve">testing </w:t>
+      </w:r>
+      <w:r>
+        <w:rPr>
+          <w:b/>
+          <w:bCs/>
+        </w:rPr>
+        <w:t>threshold</w:t>
+      </w:r>
+    </w:p>
+    <w:p>
+      <w:pPr>
+        <w:pStyle w:val="FadeOut"/>
+        <w:jc w:val="left"/>
+      </w:pPr>
+      <w:r>
+        <w:t>[action]</w:t>
+      </w:r>
+    </w:p>
+    <w:p>
+      <w:pPr>
+        <w:pStyle w:val="CharacterName"/>
+      </w:pPr>
+      <w:r>
+        <w:t>nico (V.o.)</w:t>
+      </w:r>
+    </w:p>
+    <w:p>
+      <w:pPr>
+        <w:pStyle w:val="Dialogue"/>
+      </w:pPr>
+      <w:r>
+        <w:t>[DIALOGUE]</w:t>
+      </w:r>
+    </w:p>
+    <w:p>
+      <w:pPr>
+        <w:pStyle w:val="Transition"/>
+      </w:pPr>
+      <w:r>
+        <w:t>[TRANSITION:]</w:t>
+      </w:r>
+    </w:p>
+    <w:p>
+      <w:pPr>
+        <w:pStyle w:val="ActionSceneSetting"/>
+        <w:rPr>
+          <w:rStyle w:val="Strong"/>
+          <w:b w:val="0"/>
+          <w:bCs w:val="0"/>
+        </w:rPr>
+      </w:pPr>
+      <w:r>
+        <w:rPr>
+          <w:b/>
+          <w:bCs/>
+        </w:rPr>
+        <w:t>[</w:t>
+      </w:r>
+      <w:r>
+        <w:rPr>
+          <w:b/>
+          <w:bCs/>
+        </w:rPr>
+        <w:t>int.</w:t>
+      </w:r>
+      <w:r>
+        <w:rPr>
+          <w:b/>
+          <w:bCs/>
+        </w:rPr>
+        <w:t>]</w:t>
+      </w:r>
+      <w:r>
+        <w:rPr>
+          <w:rStyle w:val="Strong"/>
+          <w:b w:val="0"/>
+          <w:bCs w:val="0"/>
+        </w:rPr>
+        <w:t xml:space="preserve"> </w:t>
+      </w:r>
+      <w:r>
+        <w:rPr>
+          <w:b/>
+          <w:bCs/>
+        </w:rPr>
+        <w:t>studio</w:t>
+      </w:r>
+      <w:r>
+        <w:rPr>
+          <w:rStyle w:val="Strong"/>
+          <w:b w:val="0"/>
+          <w:bCs w:val="0"/>
+        </w:rPr>
+        <w:t xml:space="preserve"> </w:t>
+      </w:r>
+      <w:r>
+        <w:rPr>
+          <w:rStyle w:val="Strong"/>
+        </w:rPr>
+        <w:t>—</w:t>
+      </w:r>
+      <w:r>
+        <w:rPr>
+          <w:rStyle w:val="Strong"/>
+          <w:b w:val="0"/>
+          <w:bCs w:val="0"/>
+        </w:rPr>
+        <w:t xml:space="preserve"> </w:t>
+      </w:r>
+      <w:r>
+        <w:rPr>
+          <w:rStyle w:val="Strong"/>
+        </w:rPr>
+        <w:t>close</w:t>
+      </w:r>
+    </w:p>
+    <w:p>
+      <w:pPr>
+        <w:pStyle w:val="FadeOut"/>
+        <w:jc w:val="left"/>
+      </w:pPr>
+      <w:r>
+        <w:t>[action]</w:t>
+      </w:r>
+    </w:p>
+    <w:p>
+      <w:pPr>
+        <w:pStyle w:val="CharacterName"/>
+      </w:pPr>
+      <w:r>
+        <w:t>nico (talking head)</w:t>
+      </w:r>
+    </w:p>
+    <w:p>
+      <w:pPr>
+        <w:pStyle w:val="Dialogue"/>
+      </w:pPr>
+      <w:r>
+        <w:t>[DIALOGUE]</w:t>
+      </w:r>
+    </w:p>
+    <w:p>
+      <w:pPr>
+        <w:pStyle w:val="Transition"/>
+      </w:pPr>
+    </w:p>
+    <w:p>
+      <w:pPr>
+        <w:pStyle w:val="Transition"/>
+      </w:pPr>
+    </w:p>
+    <w:p>
+      <w:pPr>
+        <w:pStyle w:val="Transition"/>
+      </w:pPr>
+    </w:p>
+    <w:p>
+      <w:pPr>
+        <w:pStyle w:val="Transition"/>
+      </w:pPr>
+    </w:p>
+    <w:p>
+      <w:pPr>
+        <w:pStyle w:val="FadeOut"/>
+        <w:jc w:val="left"/>
+      </w:pPr>
+    </w:p>
+    <w:p>
+      <w:pPr>
+        <w:pStyle w:val="Transition"/>
+      </w:pPr>
     </w:p>
     <w:sdt>
       <w:sdtPr>
@@ -430,11 +1262,6 @@
     </w:p>
     <w:p>
       <w:pPr>
-        <w:pStyle w:val="TheEnd"/>
-      </w:pPr>
-    </w:p>
-    <w:p>
-      <w:pPr>
         <w:tabs>
           <w:tab w:val="left" w:pos="1635"/>
         </w:tabs>
@@ -453,7 +1280,7 @@
         </w:rPr>
         <w:lastRenderedPageBreak/>
         <w:drawing>
-          <wp:inline distT="0" distB="0" distL="0" distR="0" wp14:anchorId="5BAD1945" wp14:editId="2BDF1C28">
+          <wp:inline distT="0" distB="0" distL="0" distR="0" wp14:anchorId="5BAD1945" wp14:editId="03995AB5">
             <wp:extent cx="5943600" cy="3343275"/>
             <wp:effectExtent l="0" t="0" r="0" b="9525"/>
             <wp:docPr id="5" name="Picture 5"/>
@@ -2291,58 +3118,6 @@
     </w:docPart>
     <w:docPart>
       <w:docPartPr>
-        <w:name w:val="706429FC64324BE685B1B4331B38E816"/>
-        <w:category>
-          <w:name w:val="General"/>
-          <w:gallery w:val="placeholder"/>
-        </w:category>
-        <w:types>
-          <w:type w:val="bbPlcHdr"/>
-        </w:types>
-        <w:behaviors>
-          <w:behavior w:val="content"/>
-        </w:behaviors>
-        <w:guid w:val="{85D1702D-7650-4ADD-BA52-F4846E668239}"/>
-      </w:docPartPr>
-      <w:docPartBody>
-        <w:p>
-          <w:pPr>
-            <w:pStyle w:val="706429FC64324BE685B1B4331B38E816"/>
-          </w:pPr>
-          <w:r>
-            <w:t>INT/EXT.</w:t>
-          </w:r>
-        </w:p>
-      </w:docPartBody>
-    </w:docPart>
-    <w:docPart>
-      <w:docPartPr>
-        <w:name w:val="C6F514B109F24F41B97B66C94B5DA893"/>
-        <w:category>
-          <w:name w:val="General"/>
-          <w:gallery w:val="placeholder"/>
-        </w:category>
-        <w:types>
-          <w:type w:val="bbPlcHdr"/>
-        </w:types>
-        <w:behaviors>
-          <w:behavior w:val="content"/>
-        </w:behaviors>
-        <w:guid w:val="{3DF38A09-B60C-40CB-B416-4ADF752BCBBA}"/>
-      </w:docPartPr>
-      <w:docPartBody>
-        <w:p>
-          <w:pPr>
-            <w:pStyle w:val="C6F514B109F24F41B97B66C94B5DA893"/>
-          </w:pPr>
-          <w:r>
-            <w:t>[LOCATION]</w:t>
-          </w:r>
-        </w:p>
-      </w:docPartBody>
-    </w:docPart>
-    <w:docPart>
-      <w:docPartPr>
         <w:name w:val="7E1CF0D12BE34723BA64D7AC500C5C6E"/>
         <w:category>
           <w:name w:val="General"/>
@@ -2680,6 +3455,8 @@
     <w:rsid w:val="00376DF5"/>
     <w:rsid w:val="006646A4"/>
     <w:rsid w:val="006B176C"/>
+    <w:rsid w:val="007A42DD"/>
+    <w:rsid w:val="007C3424"/>
     <w:rsid w:val="009A06D9"/>
     <w:rsid w:val="00AA12FB"/>
     <w:rsid w:val="00AB0EB1"/>
@@ -3191,21 +3968,6 @@
   <w:style w:type="paragraph" w:customStyle="1" w:styleId="FC46A03059CC48A8BA1E427D6A9F1FC2">
     <w:name w:val="FC46A03059CC48A8BA1E427D6A9F1FC2"/>
   </w:style>
-  <w:style w:type="paragraph" w:customStyle="1" w:styleId="F5EDCB2E21934D709BE01DE275411CAA">
-    <w:name w:val="F5EDCB2E21934D709BE01DE275411CAA"/>
-  </w:style>
-  <w:style w:type="paragraph" w:customStyle="1" w:styleId="01151137B6424C7C9C53C733D4EA266B">
-    <w:name w:val="01151137B6424C7C9C53C733D4EA266B"/>
-  </w:style>
-  <w:style w:type="paragraph" w:customStyle="1" w:styleId="B7BC3DBD85B84DDD8EE791BD352DF44B">
-    <w:name w:val="B7BC3DBD85B84DDD8EE791BD352DF44B"/>
-  </w:style>
-  <w:style w:type="paragraph" w:customStyle="1" w:styleId="8DDF674D2B3B4F1B90B10294CA8D64CD">
-    <w:name w:val="8DDF674D2B3B4F1B90B10294CA8D64CD"/>
-  </w:style>
-  <w:style w:type="paragraph" w:customStyle="1" w:styleId="D1D0A3D7B7484D6C8894DE561075414F">
-    <w:name w:val="D1D0A3D7B7484D6C8894DE561075414F"/>
-  </w:style>
   <w:style w:type="paragraph" w:customStyle="1" w:styleId="CC4AB8EA79C74902BC19E64429E6708C">
     <w:name w:val="CC4AB8EA79C74902BC19E64429E6708C"/>
   </w:style>
@@ -3446,15 +4208,18 @@
 </file>
 
 <file path=customXml/item1.xml><?xml version="1.0" encoding="utf-8"?>
-<?mso-contentType ?>
-<FormTemplates xmlns="http://schemas.microsoft.com/sharepoint/v3/contenttype/forms">
-  <Display>DocumentLibraryForm</Display>
-  <Edit>DocumentLibraryForm</Edit>
-  <New>DocumentLibraryForm</New>
-</FormTemplates>
+<p:properties xmlns:p="http://schemas.microsoft.com/office/2006/metadata/properties" xmlns:xsi="http://www.w3.org/2001/XMLSchema-instance" xmlns:pc="http://schemas.microsoft.com/office/infopath/2007/PartnerControls">
+  <documentManagement>
+    <MediaServiceKeyPoints xmlns="71af3243-3dd4-4a8d-8c0d-dd76da1f02a5" xsi:nil="true"/>
+  </documentManagement>
+</p:properties>
 </file>
 
 <file path=customXml/item2.xml><?xml version="1.0" encoding="utf-8"?>
+<b:Sources xmlns:b="http://schemas.openxmlformats.org/officeDocument/2006/bibliography" xmlns="http://schemas.openxmlformats.org/officeDocument/2006/bibliography" SelectedStyle="\APASixthEditionOfficeOnline.xsl" StyleName="APA" Version="6"/>
+</file>
+
+<file path=customXml/item3.xml><?xml version="1.0" encoding="utf-8"?>
 <ct:contentTypeSchema xmlns:ct="http://schemas.microsoft.com/office/2006/metadata/contentType" xmlns:ma="http://schemas.microsoft.com/office/2006/metadata/properties/metaAttributes" ct:_="" ma:_="" ma:contentTypeName="Document" ma:contentTypeID="0x01010079F111ED35F8CC479449609E8A0923A6" ma:contentTypeVersion="11" ma:contentTypeDescription="Create a new document." ma:contentTypeScope="" ma:versionID="1c2eb7a32e66fb6e4260f3771546a5e2">
   <xsd:schema xmlns:xsd="http://www.w3.org/2001/XMLSchema" xmlns:xs="http://www.w3.org/2001/XMLSchema" xmlns:p="http://schemas.microsoft.com/office/2006/metadata/properties" xmlns:ns2="71af3243-3dd4-4a8d-8c0d-dd76da1f02a5" xmlns:ns3="16c05727-aa75-4e4a-9b5f-8a80a1165891" targetNamespace="http://schemas.microsoft.com/office/2006/metadata/properties" ma:root="true" ma:fieldsID="04e1f6479c48b08974ba73b5ca973489" ns2:_="" ns3:_="">
     <xsd:import namespace="71af3243-3dd4-4a8d-8c0d-dd76da1f02a5"/>
@@ -3665,27 +4430,34 @@
 </ct:contentTypeSchema>
 </file>
 
-<file path=customXml/item3.xml><?xml version="1.0" encoding="utf-8"?>
-<b:Sources xmlns:b="http://schemas.openxmlformats.org/officeDocument/2006/bibliography" xmlns="http://schemas.openxmlformats.org/officeDocument/2006/bibliography" SelectedStyle="\APASixthEditionOfficeOnline.xsl" StyleName="APA" Version="6"/>
-</file>
-
 <file path=customXml/item4.xml><?xml version="1.0" encoding="utf-8"?>
-<p:properties xmlns:p="http://schemas.microsoft.com/office/2006/metadata/properties" xmlns:xsi="http://www.w3.org/2001/XMLSchema-instance" xmlns:pc="http://schemas.microsoft.com/office/infopath/2007/PartnerControls">
-  <documentManagement>
-    <MediaServiceKeyPoints xmlns="71af3243-3dd4-4a8d-8c0d-dd76da1f02a5" xsi:nil="true"/>
-  </documentManagement>
-</p:properties>
+<?mso-contentType ?>
+<FormTemplates xmlns="http://schemas.microsoft.com/sharepoint/v3/contenttype/forms">
+  <Display>DocumentLibraryForm</Display>
+  <Edit>DocumentLibraryForm</Edit>
+  <New>DocumentLibraryForm</New>
+</FormTemplates>
 </file>
 
 <file path=customXml/itemProps1.xml><?xml version="1.0" encoding="utf-8"?>
-<ds:datastoreItem xmlns:ds="http://schemas.openxmlformats.org/officeDocument/2006/customXml" ds:itemID="{AB0AF3B4-4A29-4671-A3FB-D7C7F859B68D}">
+<ds:datastoreItem xmlns:ds="http://schemas.openxmlformats.org/officeDocument/2006/customXml" ds:itemID="{EFF0764C-D8A9-4445-81EB-F12FF183070E}">
   <ds:schemaRefs>
-    <ds:schemaRef ds:uri="http://schemas.microsoft.com/sharepoint/v3/contenttype/forms"/>
+    <ds:schemaRef ds:uri="http://schemas.microsoft.com/office/2006/metadata/properties"/>
+    <ds:schemaRef ds:uri="http://schemas.microsoft.com/office/infopath/2007/PartnerControls"/>
+    <ds:schemaRef ds:uri="71af3243-3dd4-4a8d-8c0d-dd76da1f02a5"/>
   </ds:schemaRefs>
 </ds:datastoreItem>
 </file>
 
 <file path=customXml/itemProps2.xml><?xml version="1.0" encoding="utf-8"?>
+<ds:datastoreItem xmlns:ds="http://schemas.openxmlformats.org/officeDocument/2006/customXml" ds:itemID="{0A1744EC-CE08-42A8-82F4-5D9AD2A733E7}">
+  <ds:schemaRefs>
+    <ds:schemaRef ds:uri="http://schemas.openxmlformats.org/officeDocument/2006/bibliography"/>
+  </ds:schemaRefs>
+</ds:datastoreItem>
+</file>
+
+<file path=customXml/itemProps3.xml><?xml version="1.0" encoding="utf-8"?>
 <ds:datastoreItem xmlns:ds="http://schemas.openxmlformats.org/officeDocument/2006/customXml" ds:itemID="{180B909D-9885-4455-A12D-2E100423F885}">
   <ds:schemaRefs>
     <ds:schemaRef ds:uri="http://schemas.microsoft.com/office/2006/metadata/contentType"/>
@@ -3704,20 +4476,10 @@
 </ds:datastoreItem>
 </file>
 
-<file path=customXml/itemProps3.xml><?xml version="1.0" encoding="utf-8"?>
-<ds:datastoreItem xmlns:ds="http://schemas.openxmlformats.org/officeDocument/2006/customXml" ds:itemID="{0A1744EC-CE08-42A8-82F4-5D9AD2A733E7}">
+<file path=customXml/itemProps4.xml><?xml version="1.0" encoding="utf-8"?>
+<ds:datastoreItem xmlns:ds="http://schemas.openxmlformats.org/officeDocument/2006/customXml" ds:itemID="{AB0AF3B4-4A29-4671-A3FB-D7C7F859B68D}">
   <ds:schemaRefs>
-    <ds:schemaRef ds:uri="http://schemas.openxmlformats.org/officeDocument/2006/bibliography"/>
-  </ds:schemaRefs>
-</ds:datastoreItem>
-</file>
-
-<file path=customXml/itemProps4.xml><?xml version="1.0" encoding="utf-8"?>
-<ds:datastoreItem xmlns:ds="http://schemas.openxmlformats.org/officeDocument/2006/customXml" ds:itemID="{EFF0764C-D8A9-4445-81EB-F12FF183070E}">
-  <ds:schemaRefs>
-    <ds:schemaRef ds:uri="http://schemas.microsoft.com/office/2006/metadata/properties"/>
-    <ds:schemaRef ds:uri="http://schemas.microsoft.com/office/infopath/2007/PartnerControls"/>
-    <ds:schemaRef ds:uri="71af3243-3dd4-4a8d-8c0d-dd76da1f02a5"/>
+    <ds:schemaRef ds:uri="http://schemas.microsoft.com/sharepoint/v3/contenttype/forms"/>
   </ds:schemaRefs>
 </ds:datastoreItem>
 </file>
</xml_diff>